<commit_message>
feat(ci): GitHub Actions rules-sync workflow + agent --once --ci flags
Word docs repo'ya pushlandiginda Action otomatik calisir, rule-agent
--once --ci ile docx'leri OpenAI uzerinden parse edip rules.json'i
update eder, bot olarak commit+push -> Netlify auto-deploy.

KT proxy bypass: Action runner OpenAI'a ulasabiliyor.

Co-authored-by: Copilot <223556219+Copilot@users.noreply.github.com>
</commit_message>
<xml_diff>
--- a/rules-docs/avans-kapama.docx
+++ b/rules-docs/avans-kapama.docx
@@ -20,7 +20,7 @@
     </w:p>
     <w:p>
       <w:r>
-        <w:t xml:space="preserve">Avans kapama denetimi, proje finansmanı için verilen avansın doğru süre içinde kapatılıp kapatılmadığını denetler. Doğru kapama günü = vade gün × kural yüzdesi (varsayılan %30), azami 90 gün üst sınırı uygulanır. Hafta sonuna denk gelen kapama tarihleri Pazartesi'ye çekilir. İstisna kayıtları komite onayı ile geçici olarak tolere edilebilir; ancak istisna dayanağı (onay belgesi) ibraz edilmelidir.</w:t>
+        <w:t xml:space="preserve">Avans kapama denetimi, proje finansmanı için verilen avansın doğru süre içinde kapatılıp kapatılmadığını denetler. Doğru kapama günü = vade gün × kural yüzdesi (GÜNCELLENDİ: varsayılan %35), azami 100 gün üst sınırı uygulanır. Hafta sonuna denk gelen kapama tarihleri Pazartesi'ye çekilir. İstisna kayıtları komite onayı ile geçici olarak tolere edilebilir; ancak istisna dayanağı (onay belgesi) ibraz edilmelidir.</w:t>
       </w:r>
     </w:p>
     <w:p>
@@ -33,12 +33,12 @@
     </w:p>
     <w:p>
       <w:r>
-        <w:t xml:space="preserve">Kural yüzdesi: %30</w:t>
-      </w:r>
-    </w:p>
-    <w:p>
-      <w:r>
-        <w:t xml:space="preserve">Azami kapama günü: 90 gün</w:t>
+        <w:t xml:space="preserve">Kural yüzdesi: %35</w:t>
+      </w:r>
+    </w:p>
+    <w:p>
+      <w:r>
+        <w:t xml:space="preserve">Azami kapama günü: 100 gün</w:t>
       </w:r>
     </w:p>
     <w:p>
@@ -61,27 +61,27 @@
     </w:p>
     <w:p>
       <w:r>
-        <w:t xml:space="preserve">Aşım var, istisna yok: Kapama tarihi sınırı aşmış ve istisna kaydı bulunamadıysa risk yüksek. Azami günü de geçtiyse skor 94, geçmediyse 80. Bulgu mesajı doğru kapama tarihi ve mevcut kayıt arasındaki farkı içermeli.</w:t>
-      </w:r>
-    </w:p>
-    <w:p>
-      <w:r>
-        <w:t xml:space="preserve">Aşım var, istisna var ama dayanak belge yok: Skor katı politikada 76, yumuşak politikada 56. İstisna dayanağının komite onay kaydıyla tamamlanması istenmeli.</w:t>
-      </w:r>
-    </w:p>
-    <w:p>
-      <w:r>
-        <w:t xml:space="preserve">Aşım var, istisna ve dayanak belgesi var: Skor 42. Dayanak belgesi rapora eklenmeli, iz kayıtları korunmalı.</w:t>
-      </w:r>
-    </w:p>
-    <w:p>
-      <w:r>
-        <w:t xml:space="preserve">Finansman tarihi eksik: Hesaplama yapılamaz. Skor 38. Excel'e Finansman Tarihi alanı eklenmeli.</w:t>
-      </w:r>
-    </w:p>
-    <w:p>
-      <w:r>
-        <w:t xml:space="preserve">Uyumlu: Skor 16. Standart izleme yeterli.</w:t>
+        <w:t xml:space="preserve">Aşım var, istisna yok: Kapama tarihi sınırı aşmış ve istisna kaydı bulunamadıysa risk yüksek. Azami günü de geçtiyse skor 95, geçmediyse 85. Bulgu mesajı doğru kapama tarihi ve mevcut kayıt arasındaki farkı içermeli.</w:t>
+      </w:r>
+    </w:p>
+    <w:p>
+      <w:r>
+        <w:t xml:space="preserve">Aşım var, istisna var ama dayanak belge yok: Skor katı politikada 78, yumuşak politikada 58. İstisna dayanağının komite onay kaydıyla tamamlanması istenmeli.</w:t>
+      </w:r>
+    </w:p>
+    <w:p>
+      <w:r>
+        <w:t xml:space="preserve">Aşım var, istisna ve dayanak belgesi var: Skor 44. Dayanak belgesi rapora eklenmeli, iz kayıtları korunmalı.</w:t>
+      </w:r>
+    </w:p>
+    <w:p>
+      <w:r>
+        <w:t xml:space="preserve">Finansman tarihi eksik: Hesaplama yapılamaz. Skor 40. Excel'e Finansman Tarihi alanı eklenmeli.</w:t>
+      </w:r>
+    </w:p>
+    <w:p>
+      <w:r>
+        <w:t xml:space="preserve">Uyumlu: Skor 18. Standart izleme yeterli.</w:t>
       </w:r>
     </w:p>
     <w:sectPr>

</xml_diff>

<commit_message>
test(rules): avans-kapama Word güncellemesi - CI agent doğrulaması
Co-authored-by: Copilot <223556219+Copilot@users.noreply.github.com>
</commit_message>
<xml_diff>
--- a/rules-docs/avans-kapama.docx
+++ b/rules-docs/avans-kapama.docx
@@ -68,7 +68,10 @@
         <w:t>Azami kapama günü: 1</w:t>
       </w:r>
       <w:r>
-        <w:t>20</w:t>
+        <w:t>3</w:t>
+      </w:r>
+      <w:r>
+        <w:t>0</w:t>
       </w:r>
       <w:r>
         <w:t xml:space="preserve"> gün</w:t>

</xml_diff>

<commit_message>
chore(rules): OneDrive senkronu — avans-kapama.docx
Co-authored-by: Copilot <223556219+Copilot@users.noreply.github.com>
</commit_message>
<xml_diff>
--- a/rules-docs/avans-kapama.docx
+++ b/rules-docs/avans-kapama.docx
@@ -7,7 +7,31 @@
         <w:pStyle w:val="Heading1"/>
       </w:pPr>
       <w:r>
-        <w:t>Avans Kapama Kontrolü (control type: advance)</w:t>
+        <w:t>Avans Kapama Kontrolü (</w:t>
+      </w:r>
+      <w:proofErr w:type="spellStart"/>
+      <w:r>
+        <w:t>control</w:t>
+      </w:r>
+      <w:proofErr w:type="spellEnd"/>
+      <w:r>
+        <w:t xml:space="preserve"> </w:t>
+      </w:r>
+      <w:proofErr w:type="spellStart"/>
+      <w:r>
+        <w:t>type</w:t>
+      </w:r>
+      <w:proofErr w:type="spellEnd"/>
+      <w:r>
+        <w:t xml:space="preserve">: </w:t>
+      </w:r>
+      <w:proofErr w:type="spellStart"/>
+      <w:r>
+        <w:t>advance</w:t>
+      </w:r>
+      <w:proofErr w:type="spellEnd"/>
+      <w:r>
+        <w:t>)</w:t>
       </w:r>
     </w:p>
     <w:p>
@@ -36,7 +60,7 @@
         <w:t>Kural yüzdesi: %</w:t>
       </w:r>
       <w:r>
-        <w:t>6</w:t>
+        <w:t>7</w:t>
       </w:r>
       <w:r>
         <w:t>0</w:t>
@@ -47,7 +71,7 @@
         <w:t>Azami kapama günü: 1</w:t>
       </w:r>
       <w:r>
-        <w:t>3</w:t>
+        <w:t>5</w:t>
       </w:r>
       <w:r>
         <w:t>0</w:t>
@@ -63,7 +87,15 @@
     </w:p>
     <w:p>
       <w:r>
-        <w:t>İstisna politikası: lower (yumuşak)</w:t>
+        <w:t xml:space="preserve">İstisna politikası: </w:t>
+      </w:r>
+      <w:proofErr w:type="spellStart"/>
+      <w:r>
+        <w:t>lower</w:t>
+      </w:r>
+      <w:proofErr w:type="spellEnd"/>
+      <w:r>
+        <w:t xml:space="preserve"> (yumuşak)</w:t>
       </w:r>
     </w:p>
     <w:p>

</xml_diff>